<commit_message>
docs(ia): atualizar RIA-014 com link do PR #2 e encerrar pendencia
</commit_message>
<xml_diff>
--- a/docs/governanca-ia/exportados/14_Fundacao_Tecnica_do_FluxID.docx
+++ b/docs/governanca-ia/exportados/14_Fundacao_Tecnica_do_FluxID.docx
@@ -681,7 +681,7 @@
                 <w:color w:val="000000"/>
                 <w:sz w:val="19"/>
               </w:rPr>
-              <w:t>Implementação completa do shell web em TypeScript/React sem regras de negócio, fábrica de cliente Supabase singleton por endpoint ativo, resolvedor sequencial (local -&gt; lan -&gt; cloud) com probe leve de saúde em /auth/v1/health, classificador arquitetural de falhas impedindo fallback em erros 4xx/RLS, testes de contrato/unidade/integração/E2E e configuração PWA com isolamento total do cache em relação ao Supabase. Código e testes disponíveis para revisão na branch: https://github.com/aalissonalmeidaq/fluxid_integra2026/tree/chore/bootstrap-antigravity</w:t>
+              <w:t>Implementação completa do shell web em TypeScript/React sem regras de negócio, fábrica de cliente Supabase singleton por endpoint ativo, resolvedor sequencial (local -&gt; lan -&gt; cloud) com probe leve de saúde em /auth/v1/health, classificador arquitetural de falhas impedindo fallback em erros 4xx/RLS, testes de contrato/unidade/integração/E2E e configuração PWA com isolamento total do cache em relação ao Supabase. Código e testes disponíveis para revisão no Pull Request: https://github.com/aalissonalmeidaq/fluxid_integra2026/pull/2</w:t>
             </w:r>
           </w:p>
         </w:tc>
@@ -1235,7 +1235,7 @@
                 <w:color w:val="000000"/>
                 <w:sz w:val="19"/>
               </w:rPr>
-              <w:t>Substituir o link da branch pelo link definitivo do Pull Request antes de efetuar o merge na branch principal main (vinculado à issue #1).</w:t>
+              <w:t>Nenhuma pendência declarada. Pull Request #2 aberto e vinculado à issue #1.</w:t>
             </w:r>
           </w:p>
         </w:tc>

</xml_diff>

<commit_message>
fix(core): resolve bloqueadores da revisão da Spec 001
</commit_message>
<xml_diff>
--- a/docs/governanca-ia/exportados/14_Fundacao_Tecnica_do_FluxID.docx
+++ b/docs/governanca-ia/exportados/14_Fundacao_Tecnica_do_FluxID.docx
@@ -841,7 +841,7 @@
                 <w:color w:val="000000"/>
                 <w:sz w:val="19"/>
               </w:rPr>
-              <w:t>Execução completa dos gates automatizados: tsc --noEmit (0 erros), eslint . (0 avisos), 63 testes Vitest aprovados (93.3% de cobertura de linhas e 97.6% de funções), 15 testes Playwright E2E aprovados em Desktop, Tablet e Mobile 360px sem violações axe-core, e npm run build gerando bundle de produção em 927 ms. Relatório detalhado em specs/001-fundacao-tecnica/validation.md.</w:t>
+              <w:t>Execução completa dos gates automatizados: tsc --noEmit (0 erros), eslint . (0 avisos), 69 testes Vitest aprovados (93.39% de cobertura de linhas e 95.55% de funções), 24 testes Playwright E2E aprovados em Desktop, Tablet e Mobile 360px sem violações axe-core críticas ou graves, e npm run build gerando bundle de produção em 840 ms. Resolução integral de todos os bloqueadores da PR #2. Relatório detalhado em specs/001-fundacao-tecnica/validation.md.</w:t>
             </w:r>
           </w:p>
         </w:tc>
@@ -1162,7 +1162,7 @@
                 <w:color w:val="000000"/>
                 <w:sz w:val="19"/>
               </w:rPr>
-              <w:t>28/09/2026, 11:40:24 - America/Fortaleza</w:t>
+              <w:t>28/09/2026, 16:25:00 - America/Fortaleza</w:t>
             </w:r>
           </w:p>
         </w:tc>

</xml_diff>